<commit_message>
Set the GLKN change window to 2010 to 2020 in Chapter 3 tables and caption
Insert the 2010 to 2020 year window into the three Chapter 3 table captions and the
Table C subtitle, drop the "window not recorded" notes, and update the
change-detection-rate figure caption to state the same window.

Co-Authored-By: Claude Opus 4.8 (1M context) <noreply@anthropic.com>
</commit_message>
<xml_diff>
--- a/manuscript_formatting/tables/chapter3_table_polygon_size_by_agent.docx
+++ b/manuscript_formatting/tables/chapter3_table_polygon_size_by_agent.docx
@@ -28,7 +28,7 @@
           <w:color w:val="404040"/>
           <w:sz w:val="22"/>
         </w:rPr>
-        <w:t>GLKN watersheds</w:t>
+        <w:t>GLKN watersheds, 2010 to 2020</w:t>
       </w:r>
     </w:p>
     <w:tbl>
@@ -844,7 +844,7 @@
           <w:color w:val="404040"/>
           <w:sz w:val="18"/>
         </w:rPr>
-        <w:t>Areas converted to hectares (min, median, mean, standard deviation, and max) and square kilometers (total). Insect and disease rests on few polygons (99), so its distribution statistics are based on limited data. Beaver is absent from the polygon-size export and is not shown here; rerun the GEE export to include it. The source export does not record a year window.</w:t>
+        <w:t>Areas converted to hectares (min, median, mean, standard deviation, and max) and square kilometers (total). Insect and disease rests on few polygons (99), so its distribution statistics are based on limited data. Beaver is absent from the polygon-size export and is not shown here; rerun the GEE export to include it.</w:t>
       </w:r>
     </w:p>
     <w:sectPr>

</xml_diff>

<commit_message>
Rebuild Table C from the current GLKN files, drop the old polygon-size export
Remove glkn_polygon_area_by_agent_4_28_26.csv (superseded) and rebuild the
disturbance-polygon-size table from the per-year glkn_eda_changeagents files in the
current GLKN Drive folders, aggregated per agent over 2017 to 2020. This now
includes beaver (present in the per-year files). The per-year files carry no
polygon-level areas, so a pooled median and standard deviation are not recoverable
and are omitted, with a footnote saying so. Tables A and B are unchanged (grid
cell-size file).

Co-Authored-By: Claude Opus 4.8 (1M context) <noreply@anthropic.com>
</commit_message>
<xml_diff>
--- a/manuscript_formatting/tables/chapter3_table_polygon_size_by_agent.docx
+++ b/manuscript_formatting/tables/chapter3_table_polygon_size_by_agent.docx
@@ -28,7 +28,7 @@
           <w:color w:val="404040"/>
           <w:sz w:val="22"/>
         </w:rPr>
-        <w:t>GLKN watersheds, 2010 to 2020</w:t>
+        <w:t>GLKN watersheds, 2017 to 2020</w:t>
       </w:r>
     </w:p>
     <w:tbl>
@@ -38,19 +38,17 @@
         <w:tblLook w:firstColumn="1" w:firstRow="1" w:lastColumn="0" w:lastRow="0" w:noHBand="0" w:noVBand="1" w:val="04A0"/>
       </w:tblPr>
       <w:tblGrid>
-        <w:gridCol w:w="1080"/>
-        <w:gridCol w:w="1080"/>
-        <w:gridCol w:w="1080"/>
-        <w:gridCol w:w="1080"/>
-        <w:gridCol w:w="1080"/>
-        <w:gridCol w:w="1080"/>
-        <w:gridCol w:w="1080"/>
-        <w:gridCol w:w="1080"/>
+        <w:gridCol w:w="1440"/>
+        <w:gridCol w:w="1440"/>
+        <w:gridCol w:w="1440"/>
+        <w:gridCol w:w="1440"/>
+        <w:gridCol w:w="1440"/>
+        <w:gridCol w:w="1440"/>
       </w:tblGrid>
       <w:tr>
         <w:tc>
           <w:tcPr>
-            <w:tcW w:type="dxa" w:w="1080"/>
+            <w:tcW w:type="dxa" w:w="1440"/>
             <w:vAlign w:val="bottom"/>
             <w:tcBorders>
               <w:top w:val="single" w:sz="12" w:space="0" w:color="000000"/>
@@ -75,7 +73,7 @@
         </w:tc>
         <w:tc>
           <w:tcPr>
-            <w:tcW w:type="dxa" w:w="1080"/>
+            <w:tcW w:type="dxa" w:w="1440"/>
             <w:vAlign w:val="bottom"/>
             <w:tcBorders>
               <w:top w:val="single" w:sz="12" w:space="0" w:color="000000"/>
@@ -100,7 +98,7 @@
         </w:tc>
         <w:tc>
           <w:tcPr>
-            <w:tcW w:type="dxa" w:w="1080"/>
+            <w:tcW w:type="dxa" w:w="1440"/>
             <w:vAlign w:val="bottom"/>
             <w:tcBorders>
               <w:top w:val="single" w:sz="12" w:space="0" w:color="000000"/>
@@ -125,32 +123,7 @@
         </w:tc>
         <w:tc>
           <w:tcPr>
-            <w:tcW w:type="dxa" w:w="1080"/>
-            <w:vAlign w:val="bottom"/>
-            <w:tcBorders>
-              <w:top w:val="single" w:sz="12" w:space="0" w:color="000000"/>
-              <w:bottom w:val="single" w:sz="6" w:space="0" w:color="000000"/>
-              <w:left w:val="nil"/>
-              <w:right w:val="nil"/>
-            </w:tcBorders>
-          </w:tcPr>
-          <w:p>
-            <w:pPr>
-              <w:jc w:val="right"/>
-            </w:pPr>
-            <w:r>
-              <w:rPr>
-                <w:rFonts w:ascii="Times New Roman" w:hAnsi="Times New Roman"/>
-                <w:b/>
-                <w:sz w:val="22"/>
-              </w:rPr>
-              <w:t>Median (ha)</w:t>
-            </w:r>
-          </w:p>
-        </w:tc>
-        <w:tc>
-          <w:tcPr>
-            <w:tcW w:type="dxa" w:w="1080"/>
+            <w:tcW w:type="dxa" w:w="1440"/>
             <w:vAlign w:val="bottom"/>
             <w:tcBorders>
               <w:top w:val="single" w:sz="12" w:space="0" w:color="000000"/>
@@ -175,32 +148,7 @@
         </w:tc>
         <w:tc>
           <w:tcPr>
-            <w:tcW w:type="dxa" w:w="1080"/>
-            <w:vAlign w:val="bottom"/>
-            <w:tcBorders>
-              <w:top w:val="single" w:sz="12" w:space="0" w:color="000000"/>
-              <w:bottom w:val="single" w:sz="6" w:space="0" w:color="000000"/>
-              <w:left w:val="nil"/>
-              <w:right w:val="nil"/>
-            </w:tcBorders>
-          </w:tcPr>
-          <w:p>
-            <w:pPr>
-              <w:jc w:val="right"/>
-            </w:pPr>
-            <w:r>
-              <w:rPr>
-                <w:rFonts w:ascii="Times New Roman" w:hAnsi="Times New Roman"/>
-                <w:b/>
-                <w:sz w:val="22"/>
-              </w:rPr>
-              <w:t>SD (ha)</w:t>
-            </w:r>
-          </w:p>
-        </w:tc>
-        <w:tc>
-          <w:tcPr>
-            <w:tcW w:type="dxa" w:w="1080"/>
+            <w:tcW w:type="dxa" w:w="1440"/>
             <w:vAlign w:val="bottom"/>
             <w:tcBorders>
               <w:top w:val="single" w:sz="12" w:space="0" w:color="000000"/>
@@ -225,7 +173,7 @@
         </w:tc>
         <w:tc>
           <w:tcPr>
-            <w:tcW w:type="dxa" w:w="1080"/>
+            <w:tcW w:type="dxa" w:w="1440"/>
             <w:vAlign w:val="bottom"/>
             <w:tcBorders>
               <w:top w:val="single" w:sz="12" w:space="0" w:color="000000"/>
@@ -252,7 +200,7 @@
       <w:tr>
         <w:tc>
           <w:tcPr>
-            <w:tcW w:type="dxa" w:w="1080"/>
+            <w:tcW w:type="dxa" w:w="1440"/>
             <w:tcBorders>
               <w:top w:val="nil"/>
               <w:bottom w:val="nil"/>
@@ -276,7 +224,7 @@
         </w:tc>
         <w:tc>
           <w:tcPr>
-            <w:tcW w:type="dxa" w:w="1080"/>
+            <w:tcW w:type="dxa" w:w="1440"/>
             <w:tcBorders>
               <w:top w:val="nil"/>
               <w:bottom w:val="nil"/>
@@ -294,13 +242,13 @@
                 <w:b w:val="0"/>
                 <w:sz w:val="22"/>
               </w:rPr>
-              <w:t>7,032</w:t>
+              <w:t>1,347</w:t>
             </w:r>
           </w:p>
         </w:tc>
         <w:tc>
           <w:tcPr>
-            <w:tcW w:type="dxa" w:w="1080"/>
+            <w:tcW w:type="dxa" w:w="1440"/>
             <w:tcBorders>
               <w:top w:val="nil"/>
               <w:bottom w:val="nil"/>
@@ -318,13 +266,13 @@
                 <w:b w:val="0"/>
                 <w:sz w:val="22"/>
               </w:rPr>
-              <w:t>0.80</w:t>
+              <w:t>0.81</w:t>
             </w:r>
           </w:p>
         </w:tc>
         <w:tc>
           <w:tcPr>
-            <w:tcW w:type="dxa" w:w="1080"/>
+            <w:tcW w:type="dxa" w:w="1440"/>
             <w:tcBorders>
               <w:top w:val="nil"/>
               <w:bottom w:val="nil"/>
@@ -342,13 +290,13 @@
                 <w:b w:val="0"/>
                 <w:sz w:val="22"/>
               </w:rPr>
-              <w:t>2.36</w:t>
+              <w:t>6.17</w:t>
             </w:r>
           </w:p>
         </w:tc>
         <w:tc>
           <w:tcPr>
-            <w:tcW w:type="dxa" w:w="1080"/>
+            <w:tcW w:type="dxa" w:w="1440"/>
             <w:tcBorders>
               <w:top w:val="nil"/>
               <w:bottom w:val="nil"/>
@@ -366,13 +314,13 @@
                 <w:b w:val="0"/>
                 <w:sz w:val="22"/>
               </w:rPr>
-              <w:t>7.65</w:t>
+              <w:t>81.63</w:t>
             </w:r>
           </w:p>
         </w:tc>
         <w:tc>
           <w:tcPr>
-            <w:tcW w:type="dxa" w:w="1080"/>
+            <w:tcW w:type="dxa" w:w="1440"/>
             <w:tcBorders>
               <w:top w:val="nil"/>
               <w:bottom w:val="nil"/>
@@ -390,55 +338,7 @@
                 <w:b w:val="0"/>
                 <w:sz w:val="22"/>
               </w:rPr>
-              <w:t>13.27</w:t>
-            </w:r>
-          </w:p>
-        </w:tc>
-        <w:tc>
-          <w:tcPr>
-            <w:tcW w:type="dxa" w:w="1080"/>
-            <w:tcBorders>
-              <w:top w:val="nil"/>
-              <w:bottom w:val="nil"/>
-              <w:left w:val="nil"/>
-              <w:right w:val="nil"/>
-            </w:tcBorders>
-          </w:tcPr>
-          <w:p>
-            <w:pPr>
-              <w:jc w:val="right"/>
-            </w:pPr>
-            <w:r>
-              <w:rPr>
-                <w:rFonts w:ascii="Times New Roman" w:hAnsi="Times New Roman"/>
-                <w:b w:val="0"/>
-                <w:sz w:val="22"/>
-              </w:rPr>
-              <w:t>221.69</w:t>
-            </w:r>
-          </w:p>
-        </w:tc>
-        <w:tc>
-          <w:tcPr>
-            <w:tcW w:type="dxa" w:w="1080"/>
-            <w:tcBorders>
-              <w:top w:val="nil"/>
-              <w:bottom w:val="nil"/>
-              <w:left w:val="nil"/>
-              <w:right w:val="nil"/>
-            </w:tcBorders>
-          </w:tcPr>
-          <w:p>
-            <w:pPr>
-              <w:jc w:val="right"/>
-            </w:pPr>
-            <w:r>
-              <w:rPr>
-                <w:rFonts w:ascii="Times New Roman" w:hAnsi="Times New Roman"/>
-                <w:b w:val="0"/>
-                <w:sz w:val="22"/>
-              </w:rPr>
-              <w:t>537.81</w:t>
+              <w:t>83.05</w:t>
             </w:r>
           </w:p>
         </w:tc>
@@ -446,7 +346,7 @@
       <w:tr>
         <w:tc>
           <w:tcPr>
-            <w:tcW w:type="dxa" w:w="1080"/>
+            <w:tcW w:type="dxa" w:w="1440"/>
             <w:tcBorders>
               <w:top w:val="nil"/>
               <w:bottom w:val="nil"/>
@@ -470,7 +370,7 @@
         </w:tc>
         <w:tc>
           <w:tcPr>
-            <w:tcW w:type="dxa" w:w="1080"/>
+            <w:tcW w:type="dxa" w:w="1440"/>
             <w:tcBorders>
               <w:top w:val="nil"/>
               <w:bottom w:val="nil"/>
@@ -488,13 +388,13 @@
                 <w:b w:val="0"/>
                 <w:sz w:val="22"/>
               </w:rPr>
-              <w:t>2,360</w:t>
+              <w:t>775</w:t>
             </w:r>
           </w:p>
         </w:tc>
         <w:tc>
           <w:tcPr>
-            <w:tcW w:type="dxa" w:w="1080"/>
+            <w:tcW w:type="dxa" w:w="1440"/>
             <w:tcBorders>
               <w:top w:val="nil"/>
               <w:bottom w:val="nil"/>
@@ -512,13 +412,13 @@
                 <w:b w:val="0"/>
                 <w:sz w:val="22"/>
               </w:rPr>
-              <w:t>0.80</w:t>
+              <w:t>0.81</w:t>
             </w:r>
           </w:p>
         </w:tc>
         <w:tc>
           <w:tcPr>
-            <w:tcW w:type="dxa" w:w="1080"/>
+            <w:tcW w:type="dxa" w:w="1440"/>
             <w:tcBorders>
               <w:top w:val="nil"/>
               <w:bottom w:val="nil"/>
@@ -536,13 +436,13 @@
                 <w:b w:val="0"/>
                 <w:sz w:val="22"/>
               </w:rPr>
-              <w:t>1.52</w:t>
+              <w:t>2.67</w:t>
             </w:r>
           </w:p>
         </w:tc>
         <w:tc>
           <w:tcPr>
-            <w:tcW w:type="dxa" w:w="1080"/>
+            <w:tcW w:type="dxa" w:w="1440"/>
             <w:tcBorders>
               <w:top w:val="nil"/>
               <w:bottom w:val="nil"/>
@@ -560,13 +460,13 @@
                 <w:b w:val="0"/>
                 <w:sz w:val="22"/>
               </w:rPr>
-              <w:t>2.78</w:t>
+              <w:t>38.34</w:t>
             </w:r>
           </w:p>
         </w:tc>
         <w:tc>
           <w:tcPr>
-            <w:tcW w:type="dxa" w:w="1080"/>
+            <w:tcW w:type="dxa" w:w="1440"/>
             <w:tcBorders>
               <w:top w:val="nil"/>
               <w:bottom w:val="nil"/>
@@ -584,13 +484,39 @@
                 <w:b w:val="0"/>
                 <w:sz w:val="22"/>
               </w:rPr>
-              <w:t>3.96</w:t>
+              <w:t>20.67</w:t>
+            </w:r>
+          </w:p>
+        </w:tc>
+      </w:tr>
+      <w:tr>
+        <w:tc>
+          <w:tcPr>
+            <w:tcW w:type="dxa" w:w="1440"/>
+            <w:tcBorders>
+              <w:top w:val="nil"/>
+              <w:bottom w:val="nil"/>
+              <w:left w:val="nil"/>
+              <w:right w:val="nil"/>
+            </w:tcBorders>
+          </w:tcPr>
+          <w:p>
+            <w:pPr>
+              <w:jc w:val="left"/>
+            </w:pPr>
+            <w:r>
+              <w:rPr>
+                <w:rFonts w:ascii="Times New Roman" w:hAnsi="Times New Roman"/>
+                <w:b w:val="0"/>
+                <w:sz w:val="22"/>
+              </w:rPr>
+              <w:t>Beaver</w:t>
             </w:r>
           </w:p>
         </w:tc>
         <w:tc>
           <w:tcPr>
-            <w:tcW w:type="dxa" w:w="1080"/>
+            <w:tcW w:type="dxa" w:w="1440"/>
             <w:tcBorders>
               <w:top w:val="nil"/>
               <w:bottom w:val="nil"/>
@@ -608,13 +534,13 @@
                 <w:b w:val="0"/>
                 <w:sz w:val="22"/>
               </w:rPr>
-              <w:t>47.01</w:t>
+              <w:t>53</w:t>
             </w:r>
           </w:p>
         </w:tc>
         <w:tc>
           <w:tcPr>
-            <w:tcW w:type="dxa" w:w="1080"/>
+            <w:tcW w:type="dxa" w:w="1440"/>
             <w:tcBorders>
               <w:top w:val="nil"/>
               <w:bottom w:val="nil"/>
@@ -632,7 +558,79 @@
                 <w:b w:val="0"/>
                 <w:sz w:val="22"/>
               </w:rPr>
-              <w:t>65.52</w:t>
+              <w:t>0.81</w:t>
+            </w:r>
+          </w:p>
+        </w:tc>
+        <w:tc>
+          <w:tcPr>
+            <w:tcW w:type="dxa" w:w="1440"/>
+            <w:tcBorders>
+              <w:top w:val="nil"/>
+              <w:bottom w:val="nil"/>
+              <w:left w:val="nil"/>
+              <w:right w:val="nil"/>
+            </w:tcBorders>
+          </w:tcPr>
+          <w:p>
+            <w:pPr>
+              <w:jc w:val="right"/>
+            </w:pPr>
+            <w:r>
+              <w:rPr>
+                <w:rFonts w:ascii="Times New Roman" w:hAnsi="Times New Roman"/>
+                <w:b w:val="0"/>
+                <w:sz w:val="22"/>
+              </w:rPr>
+              <w:t>2.77</w:t>
+            </w:r>
+          </w:p>
+        </w:tc>
+        <w:tc>
+          <w:tcPr>
+            <w:tcW w:type="dxa" w:w="1440"/>
+            <w:tcBorders>
+              <w:top w:val="nil"/>
+              <w:bottom w:val="nil"/>
+              <w:left w:val="nil"/>
+              <w:right w:val="nil"/>
+            </w:tcBorders>
+          </w:tcPr>
+          <w:p>
+            <w:pPr>
+              <w:jc w:val="right"/>
+            </w:pPr>
+            <w:r>
+              <w:rPr>
+                <w:rFonts w:ascii="Times New Roman" w:hAnsi="Times New Roman"/>
+                <w:b w:val="0"/>
+                <w:sz w:val="22"/>
+              </w:rPr>
+              <w:t>49.05</w:t>
+            </w:r>
+          </w:p>
+        </w:tc>
+        <w:tc>
+          <w:tcPr>
+            <w:tcW w:type="dxa" w:w="1440"/>
+            <w:tcBorders>
+              <w:top w:val="nil"/>
+              <w:bottom w:val="nil"/>
+              <w:left w:val="nil"/>
+              <w:right w:val="nil"/>
+            </w:tcBorders>
+          </w:tcPr>
+          <w:p>
+            <w:pPr>
+              <w:jc w:val="right"/>
+            </w:pPr>
+            <w:r>
+              <w:rPr>
+                <w:rFonts w:ascii="Times New Roman" w:hAnsi="Times New Roman"/>
+                <w:b w:val="0"/>
+                <w:sz w:val="22"/>
+              </w:rPr>
+              <w:t>1.47</w:t>
             </w:r>
           </w:p>
         </w:tc>
@@ -640,7 +638,7 @@
       <w:tr>
         <w:tc>
           <w:tcPr>
-            <w:tcW w:type="dxa" w:w="1080"/>
+            <w:tcW w:type="dxa" w:w="1440"/>
             <w:tcBorders>
               <w:top w:val="nil"/>
               <w:bottom w:val="single" w:sz="12" w:space="0" w:color="000000"/>
@@ -664,7 +662,7 @@
         </w:tc>
         <w:tc>
           <w:tcPr>
-            <w:tcW w:type="dxa" w:w="1080"/>
+            <w:tcW w:type="dxa" w:w="1440"/>
             <w:tcBorders>
               <w:top w:val="nil"/>
               <w:bottom w:val="single" w:sz="12" w:space="0" w:color="000000"/>
@@ -682,13 +680,13 @@
                 <w:b w:val="0"/>
                 <w:sz w:val="22"/>
               </w:rPr>
-              <w:t>99</w:t>
+              <w:t>30</w:t>
             </w:r>
           </w:p>
         </w:tc>
         <w:tc>
           <w:tcPr>
-            <w:tcW w:type="dxa" w:w="1080"/>
+            <w:tcW w:type="dxa" w:w="1440"/>
             <w:tcBorders>
               <w:top w:val="nil"/>
               <w:bottom w:val="single" w:sz="12" w:space="0" w:color="000000"/>
@@ -712,7 +710,7 @@
         </w:tc>
         <w:tc>
           <w:tcPr>
-            <w:tcW w:type="dxa" w:w="1080"/>
+            <w:tcW w:type="dxa" w:w="1440"/>
             <w:tcBorders>
               <w:top w:val="nil"/>
               <w:bottom w:val="single" w:sz="12" w:space="0" w:color="000000"/>
@@ -730,13 +728,13 @@
                 <w:b w:val="0"/>
                 <w:sz w:val="22"/>
               </w:rPr>
-              <w:t>1.47</w:t>
+              <w:t>2.16</w:t>
             </w:r>
           </w:p>
         </w:tc>
         <w:tc>
           <w:tcPr>
-            <w:tcW w:type="dxa" w:w="1080"/>
+            <w:tcW w:type="dxa" w:w="1440"/>
             <w:tcBorders>
               <w:top w:val="nil"/>
               <w:bottom w:val="single" w:sz="12" w:space="0" w:color="000000"/>
@@ -754,13 +752,13 @@
                 <w:b w:val="0"/>
                 <w:sz w:val="22"/>
               </w:rPr>
-              <w:t>2.76</w:t>
+              <w:t>7.02</w:t>
             </w:r>
           </w:p>
         </w:tc>
         <w:tc>
           <w:tcPr>
-            <w:tcW w:type="dxa" w:w="1080"/>
+            <w:tcW w:type="dxa" w:w="1440"/>
             <w:tcBorders>
               <w:top w:val="nil"/>
               <w:bottom w:val="single" w:sz="12" w:space="0" w:color="000000"/>
@@ -778,55 +776,7 @@
                 <w:b w:val="0"/>
                 <w:sz w:val="22"/>
               </w:rPr>
-              <w:t>7.72</w:t>
-            </w:r>
-          </w:p>
-        </w:tc>
-        <w:tc>
-          <w:tcPr>
-            <w:tcW w:type="dxa" w:w="1080"/>
-            <w:tcBorders>
-              <w:top w:val="nil"/>
-              <w:bottom w:val="single" w:sz="12" w:space="0" w:color="000000"/>
-              <w:left w:val="nil"/>
-              <w:right w:val="nil"/>
-            </w:tcBorders>
-          </w:tcPr>
-          <w:p>
-            <w:pPr>
-              <w:jc w:val="right"/>
-            </w:pPr>
-            <w:r>
-              <w:rPr>
-                <w:rFonts w:ascii="Times New Roman" w:hAnsi="Times New Roman"/>
-                <w:b w:val="0"/>
-                <w:sz w:val="22"/>
-              </w:rPr>
-              <w:t>77.62</w:t>
-            </w:r>
-          </w:p>
-        </w:tc>
-        <w:tc>
-          <w:tcPr>
-            <w:tcW w:type="dxa" w:w="1080"/>
-            <w:tcBorders>
-              <w:top w:val="nil"/>
-              <w:bottom w:val="single" w:sz="12" w:space="0" w:color="000000"/>
-              <w:left w:val="nil"/>
-              <w:right w:val="nil"/>
-            </w:tcBorders>
-          </w:tcPr>
-          <w:p>
-            <w:pPr>
-              <w:jc w:val="right"/>
-            </w:pPr>
-            <w:r>
-              <w:rPr>
-                <w:rFonts w:ascii="Times New Roman" w:hAnsi="Times New Roman"/>
-                <w:b w:val="0"/>
-                <w:sz w:val="22"/>
-              </w:rPr>
-              <w:t>2.74</w:t>
+              <w:t>0.65</w:t>
             </w:r>
           </w:p>
         </w:tc>
@@ -844,7 +794,7 @@
           <w:color w:val="404040"/>
           <w:sz w:val="18"/>
         </w:rPr>
-        <w:t>Areas converted to hectares (min, median, mean, standard deviation, and max) and square kilometers (total). Insect and disease rests on few polygons (99), so its distribution statistics are based on limited data. Beaver is absent from the polygon-size export and is not shown here; rerun the GEE export to include it.</w:t>
+        <w:t>Polygon counts, extents, and totals aggregated over the change years 2017 to 2020: N and total are summed, min and max are the extremes across years, and mean is total area divided by N. The per-year export does not carry the underlying polygon areas, so a pooled median and standard deviation are not recoverable and are not shown. Beaver and insect and disease rest on few polygons (see the N column), so their statistics are based on limited data.</w:t>
       </w:r>
     </w:p>
     <w:sectPr>

</xml_diff>

<commit_message>
Add 2010-2020 polygon-size and histogram exports; complete Table C and add distribution figure
Pull the two new shared files into reports/GLKN_change_agents/:
- glkn_polygon_area_by_agent_2010_2020.csv (per-agent summary with sd, all four agents including
  beaver, watershed-scoped 2010-2020)
- glkn_histograms_by_agent_2010_2020.csv (10,169 per-polygon areas, four agents, 2010-2020)

Rebuild Table C from the polygon-size summary, restoring the median and standard deviation columns
and beaver, over the 2010-2020 window. Add a per-agent polygon-size distribution figure
(plot_polygon_size_distribution.R) from the histogram export. Update the Chapter 3 inventory (both
gaps now resolved) and the READMEs.

Co-Authored-By: Claude Opus 4.8 (1M context) <noreply@anthropic.com>
</commit_message>
<xml_diff>
--- a/manuscript_formatting/tables/chapter3_table_polygon_size_by_agent.docx
+++ b/manuscript_formatting/tables/chapter3_table_polygon_size_by_agent.docx
@@ -28,7 +28,7 @@
           <w:color w:val="404040"/>
           <w:sz w:val="22"/>
         </w:rPr>
-        <w:t>GLKN watersheds, 2017 to 2020</w:t>
+        <w:t>GLKN watersheds, 2010 to 2020</w:t>
       </w:r>
     </w:p>
     <w:tbl>
@@ -38,17 +38,19 @@
         <w:tblLook w:firstColumn="1" w:firstRow="1" w:lastColumn="0" w:lastRow="0" w:noHBand="0" w:noVBand="1" w:val="04A0"/>
       </w:tblPr>
       <w:tblGrid>
-        <w:gridCol w:w="1440"/>
-        <w:gridCol w:w="1440"/>
-        <w:gridCol w:w="1440"/>
-        <w:gridCol w:w="1440"/>
-        <w:gridCol w:w="1440"/>
-        <w:gridCol w:w="1440"/>
+        <w:gridCol w:w="1080"/>
+        <w:gridCol w:w="1080"/>
+        <w:gridCol w:w="1080"/>
+        <w:gridCol w:w="1080"/>
+        <w:gridCol w:w="1080"/>
+        <w:gridCol w:w="1080"/>
+        <w:gridCol w:w="1080"/>
+        <w:gridCol w:w="1080"/>
       </w:tblGrid>
       <w:tr>
         <w:tc>
           <w:tcPr>
-            <w:tcW w:type="dxa" w:w="1440"/>
+            <w:tcW w:type="dxa" w:w="1080"/>
             <w:vAlign w:val="bottom"/>
             <w:tcBorders>
               <w:top w:val="single" w:sz="12" w:space="0" w:color="000000"/>
@@ -73,7 +75,7 @@
         </w:tc>
         <w:tc>
           <w:tcPr>
-            <w:tcW w:type="dxa" w:w="1440"/>
+            <w:tcW w:type="dxa" w:w="1080"/>
             <w:vAlign w:val="bottom"/>
             <w:tcBorders>
               <w:top w:val="single" w:sz="12" w:space="0" w:color="000000"/>
@@ -98,7 +100,7 @@
         </w:tc>
         <w:tc>
           <w:tcPr>
-            <w:tcW w:type="dxa" w:w="1440"/>
+            <w:tcW w:type="dxa" w:w="1080"/>
             <w:vAlign w:val="bottom"/>
             <w:tcBorders>
               <w:top w:val="single" w:sz="12" w:space="0" w:color="000000"/>
@@ -123,7 +125,32 @@
         </w:tc>
         <w:tc>
           <w:tcPr>
-            <w:tcW w:type="dxa" w:w="1440"/>
+            <w:tcW w:type="dxa" w:w="1080"/>
+            <w:vAlign w:val="bottom"/>
+            <w:tcBorders>
+              <w:top w:val="single" w:sz="12" w:space="0" w:color="000000"/>
+              <w:bottom w:val="single" w:sz="6" w:space="0" w:color="000000"/>
+              <w:left w:val="nil"/>
+              <w:right w:val="nil"/>
+            </w:tcBorders>
+          </w:tcPr>
+          <w:p>
+            <w:pPr>
+              <w:jc w:val="right"/>
+            </w:pPr>
+            <w:r>
+              <w:rPr>
+                <w:rFonts w:ascii="Times New Roman" w:hAnsi="Times New Roman"/>
+                <w:b/>
+                <w:sz w:val="22"/>
+              </w:rPr>
+              <w:t>Median (ha)</w:t>
+            </w:r>
+          </w:p>
+        </w:tc>
+        <w:tc>
+          <w:tcPr>
+            <w:tcW w:type="dxa" w:w="1080"/>
             <w:vAlign w:val="bottom"/>
             <w:tcBorders>
               <w:top w:val="single" w:sz="12" w:space="0" w:color="000000"/>
@@ -148,7 +175,32 @@
         </w:tc>
         <w:tc>
           <w:tcPr>
-            <w:tcW w:type="dxa" w:w="1440"/>
+            <w:tcW w:type="dxa" w:w="1080"/>
+            <w:vAlign w:val="bottom"/>
+            <w:tcBorders>
+              <w:top w:val="single" w:sz="12" w:space="0" w:color="000000"/>
+              <w:bottom w:val="single" w:sz="6" w:space="0" w:color="000000"/>
+              <w:left w:val="nil"/>
+              <w:right w:val="nil"/>
+            </w:tcBorders>
+          </w:tcPr>
+          <w:p>
+            <w:pPr>
+              <w:jc w:val="right"/>
+            </w:pPr>
+            <w:r>
+              <w:rPr>
+                <w:rFonts w:ascii="Times New Roman" w:hAnsi="Times New Roman"/>
+                <w:b/>
+                <w:sz w:val="22"/>
+              </w:rPr>
+              <w:t>SD (ha)</w:t>
+            </w:r>
+          </w:p>
+        </w:tc>
+        <w:tc>
+          <w:tcPr>
+            <w:tcW w:type="dxa" w:w="1080"/>
             <w:vAlign w:val="bottom"/>
             <w:tcBorders>
               <w:top w:val="single" w:sz="12" w:space="0" w:color="000000"/>
@@ -173,7 +225,7 @@
         </w:tc>
         <w:tc>
           <w:tcPr>
-            <w:tcW w:type="dxa" w:w="1440"/>
+            <w:tcW w:type="dxa" w:w="1080"/>
             <w:vAlign w:val="bottom"/>
             <w:tcBorders>
               <w:top w:val="single" w:sz="12" w:space="0" w:color="000000"/>
@@ -200,7 +252,7 @@
       <w:tr>
         <w:tc>
           <w:tcPr>
-            <w:tcW w:type="dxa" w:w="1440"/>
+            <w:tcW w:type="dxa" w:w="1080"/>
             <w:tcBorders>
               <w:top w:val="nil"/>
               <w:bottom w:val="nil"/>
@@ -224,7 +276,7 @@
         </w:tc>
         <w:tc>
           <w:tcPr>
-            <w:tcW w:type="dxa" w:w="1440"/>
+            <w:tcW w:type="dxa" w:w="1080"/>
             <w:tcBorders>
               <w:top w:val="nil"/>
               <w:bottom w:val="nil"/>
@@ -242,13 +294,13 @@
                 <w:b w:val="0"/>
                 <w:sz w:val="22"/>
               </w:rPr>
-              <w:t>1,347</w:t>
+              <w:t>7,032</w:t>
             </w:r>
           </w:p>
         </w:tc>
         <w:tc>
           <w:tcPr>
-            <w:tcW w:type="dxa" w:w="1440"/>
+            <w:tcW w:type="dxa" w:w="1080"/>
             <w:tcBorders>
               <w:top w:val="nil"/>
               <w:bottom w:val="nil"/>
@@ -266,13 +318,13 @@
                 <w:b w:val="0"/>
                 <w:sz w:val="22"/>
               </w:rPr>
-              <w:t>0.81</w:t>
+              <w:t>0.80</w:t>
             </w:r>
           </w:p>
         </w:tc>
         <w:tc>
           <w:tcPr>
-            <w:tcW w:type="dxa" w:w="1440"/>
+            <w:tcW w:type="dxa" w:w="1080"/>
             <w:tcBorders>
               <w:top w:val="nil"/>
               <w:bottom w:val="nil"/>
@@ -290,13 +342,13 @@
                 <w:b w:val="0"/>
                 <w:sz w:val="22"/>
               </w:rPr>
-              <w:t>6.17</w:t>
+              <w:t>2.36</w:t>
             </w:r>
           </w:p>
         </w:tc>
         <w:tc>
           <w:tcPr>
-            <w:tcW w:type="dxa" w:w="1440"/>
+            <w:tcW w:type="dxa" w:w="1080"/>
             <w:tcBorders>
               <w:top w:val="nil"/>
               <w:bottom w:val="nil"/>
@@ -314,13 +366,13 @@
                 <w:b w:val="0"/>
                 <w:sz w:val="22"/>
               </w:rPr>
-              <w:t>81.63</w:t>
+              <w:t>7.65</w:t>
             </w:r>
           </w:p>
         </w:tc>
         <w:tc>
           <w:tcPr>
-            <w:tcW w:type="dxa" w:w="1440"/>
+            <w:tcW w:type="dxa" w:w="1080"/>
             <w:tcBorders>
               <w:top w:val="nil"/>
               <w:bottom w:val="nil"/>
@@ -338,7 +390,55 @@
                 <w:b w:val="0"/>
                 <w:sz w:val="22"/>
               </w:rPr>
-              <w:t>83.05</w:t>
+              <w:t>13.27</w:t>
+            </w:r>
+          </w:p>
+        </w:tc>
+        <w:tc>
+          <w:tcPr>
+            <w:tcW w:type="dxa" w:w="1080"/>
+            <w:tcBorders>
+              <w:top w:val="nil"/>
+              <w:bottom w:val="nil"/>
+              <w:left w:val="nil"/>
+              <w:right w:val="nil"/>
+            </w:tcBorders>
+          </w:tcPr>
+          <w:p>
+            <w:pPr>
+              <w:jc w:val="right"/>
+            </w:pPr>
+            <w:r>
+              <w:rPr>
+                <w:rFonts w:ascii="Times New Roman" w:hAnsi="Times New Roman"/>
+                <w:b w:val="0"/>
+                <w:sz w:val="22"/>
+              </w:rPr>
+              <w:t>221.69</w:t>
+            </w:r>
+          </w:p>
+        </w:tc>
+        <w:tc>
+          <w:tcPr>
+            <w:tcW w:type="dxa" w:w="1080"/>
+            <w:tcBorders>
+              <w:top w:val="nil"/>
+              <w:bottom w:val="nil"/>
+              <w:left w:val="nil"/>
+              <w:right w:val="nil"/>
+            </w:tcBorders>
+          </w:tcPr>
+          <w:p>
+            <w:pPr>
+              <w:jc w:val="right"/>
+            </w:pPr>
+            <w:r>
+              <w:rPr>
+                <w:rFonts w:ascii="Times New Roman" w:hAnsi="Times New Roman"/>
+                <w:b w:val="0"/>
+                <w:sz w:val="22"/>
+              </w:rPr>
+              <w:t>537.81</w:t>
             </w:r>
           </w:p>
         </w:tc>
@@ -346,7 +446,7 @@
       <w:tr>
         <w:tc>
           <w:tcPr>
-            <w:tcW w:type="dxa" w:w="1440"/>
+            <w:tcW w:type="dxa" w:w="1080"/>
             <w:tcBorders>
               <w:top w:val="nil"/>
               <w:bottom w:val="nil"/>
@@ -370,7 +470,7 @@
         </w:tc>
         <w:tc>
           <w:tcPr>
-            <w:tcW w:type="dxa" w:w="1440"/>
+            <w:tcW w:type="dxa" w:w="1080"/>
             <w:tcBorders>
               <w:top w:val="nil"/>
               <w:bottom w:val="nil"/>
@@ -388,13 +488,13 @@
                 <w:b w:val="0"/>
                 <w:sz w:val="22"/>
               </w:rPr>
-              <w:t>775</w:t>
+              <w:t>2,360</w:t>
             </w:r>
           </w:p>
         </w:tc>
         <w:tc>
           <w:tcPr>
-            <w:tcW w:type="dxa" w:w="1440"/>
+            <w:tcW w:type="dxa" w:w="1080"/>
             <w:tcBorders>
               <w:top w:val="nil"/>
               <w:bottom w:val="nil"/>
@@ -412,13 +512,13 @@
                 <w:b w:val="0"/>
                 <w:sz w:val="22"/>
               </w:rPr>
-              <w:t>0.81</w:t>
+              <w:t>0.80</w:t>
             </w:r>
           </w:p>
         </w:tc>
         <w:tc>
           <w:tcPr>
-            <w:tcW w:type="dxa" w:w="1440"/>
+            <w:tcW w:type="dxa" w:w="1080"/>
             <w:tcBorders>
               <w:top w:val="nil"/>
               <w:bottom w:val="nil"/>
@@ -436,13 +536,13 @@
                 <w:b w:val="0"/>
                 <w:sz w:val="22"/>
               </w:rPr>
-              <w:t>2.67</w:t>
+              <w:t>1.52</w:t>
             </w:r>
           </w:p>
         </w:tc>
         <w:tc>
           <w:tcPr>
-            <w:tcW w:type="dxa" w:w="1440"/>
+            <w:tcW w:type="dxa" w:w="1080"/>
             <w:tcBorders>
               <w:top w:val="nil"/>
               <w:bottom w:val="nil"/>
@@ -460,13 +560,13 @@
                 <w:b w:val="0"/>
                 <w:sz w:val="22"/>
               </w:rPr>
-              <w:t>38.34</w:t>
+              <w:t>2.78</w:t>
             </w:r>
           </w:p>
         </w:tc>
         <w:tc>
           <w:tcPr>
-            <w:tcW w:type="dxa" w:w="1440"/>
+            <w:tcW w:type="dxa" w:w="1080"/>
             <w:tcBorders>
               <w:top w:val="nil"/>
               <w:bottom w:val="nil"/>
@@ -484,7 +584,55 @@
                 <w:b w:val="0"/>
                 <w:sz w:val="22"/>
               </w:rPr>
-              <w:t>20.67</w:t>
+              <w:t>3.96</w:t>
+            </w:r>
+          </w:p>
+        </w:tc>
+        <w:tc>
+          <w:tcPr>
+            <w:tcW w:type="dxa" w:w="1080"/>
+            <w:tcBorders>
+              <w:top w:val="nil"/>
+              <w:bottom w:val="nil"/>
+              <w:left w:val="nil"/>
+              <w:right w:val="nil"/>
+            </w:tcBorders>
+          </w:tcPr>
+          <w:p>
+            <w:pPr>
+              <w:jc w:val="right"/>
+            </w:pPr>
+            <w:r>
+              <w:rPr>
+                <w:rFonts w:ascii="Times New Roman" w:hAnsi="Times New Roman"/>
+                <w:b w:val="0"/>
+                <w:sz w:val="22"/>
+              </w:rPr>
+              <w:t>47.01</w:t>
+            </w:r>
+          </w:p>
+        </w:tc>
+        <w:tc>
+          <w:tcPr>
+            <w:tcW w:type="dxa" w:w="1080"/>
+            <w:tcBorders>
+              <w:top w:val="nil"/>
+              <w:bottom w:val="nil"/>
+              <w:left w:val="nil"/>
+              <w:right w:val="nil"/>
+            </w:tcBorders>
+          </w:tcPr>
+          <w:p>
+            <w:pPr>
+              <w:jc w:val="right"/>
+            </w:pPr>
+            <w:r>
+              <w:rPr>
+                <w:rFonts w:ascii="Times New Roman" w:hAnsi="Times New Roman"/>
+                <w:b w:val="0"/>
+                <w:sz w:val="22"/>
+              </w:rPr>
+              <w:t>65.52</w:t>
             </w:r>
           </w:p>
         </w:tc>
@@ -492,7 +640,7 @@
       <w:tr>
         <w:tc>
           <w:tcPr>
-            <w:tcW w:type="dxa" w:w="1440"/>
+            <w:tcW w:type="dxa" w:w="1080"/>
             <w:tcBorders>
               <w:top w:val="nil"/>
               <w:bottom w:val="nil"/>
@@ -516,7 +664,7 @@
         </w:tc>
         <w:tc>
           <w:tcPr>
-            <w:tcW w:type="dxa" w:w="1440"/>
+            <w:tcW w:type="dxa" w:w="1080"/>
             <w:tcBorders>
               <w:top w:val="nil"/>
               <w:bottom w:val="nil"/>
@@ -534,13 +682,13 @@
                 <w:b w:val="0"/>
                 <w:sz w:val="22"/>
               </w:rPr>
-              <w:t>53</w:t>
+              <w:t>678</w:t>
             </w:r>
           </w:p>
         </w:tc>
         <w:tc>
           <w:tcPr>
-            <w:tcW w:type="dxa" w:w="1440"/>
+            <w:tcW w:type="dxa" w:w="1080"/>
             <w:tcBorders>
               <w:top w:val="nil"/>
               <w:bottom w:val="nil"/>
@@ -558,13 +706,13 @@
                 <w:b w:val="0"/>
                 <w:sz w:val="22"/>
               </w:rPr>
-              <w:t>0.81</w:t>
+              <w:t>0.80</w:t>
             </w:r>
           </w:p>
         </w:tc>
         <w:tc>
           <w:tcPr>
-            <w:tcW w:type="dxa" w:w="1440"/>
+            <w:tcW w:type="dxa" w:w="1080"/>
             <w:tcBorders>
               <w:top w:val="nil"/>
               <w:bottom w:val="nil"/>
@@ -582,13 +730,13 @@
                 <w:b w:val="0"/>
                 <w:sz w:val="22"/>
               </w:rPr>
-              <w:t>2.77</w:t>
+              <w:t>1.30</w:t>
             </w:r>
           </w:p>
         </w:tc>
         <w:tc>
           <w:tcPr>
-            <w:tcW w:type="dxa" w:w="1440"/>
+            <w:tcW w:type="dxa" w:w="1080"/>
             <w:tcBorders>
               <w:top w:val="nil"/>
               <w:bottom w:val="nil"/>
@@ -606,13 +754,13 @@
                 <w:b w:val="0"/>
                 <w:sz w:val="22"/>
               </w:rPr>
-              <w:t>49.05</w:t>
+              <w:t>1.88</w:t>
             </w:r>
           </w:p>
         </w:tc>
         <w:tc>
           <w:tcPr>
-            <w:tcW w:type="dxa" w:w="1440"/>
+            <w:tcW w:type="dxa" w:w="1080"/>
             <w:tcBorders>
               <w:top w:val="nil"/>
               <w:bottom w:val="nil"/>
@@ -630,7 +778,55 @@
                 <w:b w:val="0"/>
                 <w:sz w:val="22"/>
               </w:rPr>
-              <w:t>1.47</w:t>
+              <w:t>2.49</w:t>
+            </w:r>
+          </w:p>
+        </w:tc>
+        <w:tc>
+          <w:tcPr>
+            <w:tcW w:type="dxa" w:w="1080"/>
+            <w:tcBorders>
+              <w:top w:val="nil"/>
+              <w:bottom w:val="nil"/>
+              <w:left w:val="nil"/>
+              <w:right w:val="nil"/>
+            </w:tcBorders>
+          </w:tcPr>
+          <w:p>
+            <w:pPr>
+              <w:jc w:val="right"/>
+            </w:pPr>
+            <w:r>
+              <w:rPr>
+                <w:rFonts w:ascii="Times New Roman" w:hAnsi="Times New Roman"/>
+                <w:b w:val="0"/>
+                <w:sz w:val="22"/>
+              </w:rPr>
+              <w:t>48.93</w:t>
+            </w:r>
+          </w:p>
+        </w:tc>
+        <w:tc>
+          <w:tcPr>
+            <w:tcW w:type="dxa" w:w="1080"/>
+            <w:tcBorders>
+              <w:top w:val="nil"/>
+              <w:bottom w:val="nil"/>
+              <w:left w:val="nil"/>
+              <w:right w:val="nil"/>
+            </w:tcBorders>
+          </w:tcPr>
+          <w:p>
+            <w:pPr>
+              <w:jc w:val="right"/>
+            </w:pPr>
+            <w:r>
+              <w:rPr>
+                <w:rFonts w:ascii="Times New Roman" w:hAnsi="Times New Roman"/>
+                <w:b w:val="0"/>
+                <w:sz w:val="22"/>
+              </w:rPr>
+              <w:t>12.74</w:t>
             </w:r>
           </w:p>
         </w:tc>
@@ -638,7 +834,7 @@
       <w:tr>
         <w:tc>
           <w:tcPr>
-            <w:tcW w:type="dxa" w:w="1440"/>
+            <w:tcW w:type="dxa" w:w="1080"/>
             <w:tcBorders>
               <w:top w:val="nil"/>
               <w:bottom w:val="single" w:sz="12" w:space="0" w:color="000000"/>
@@ -662,7 +858,7 @@
         </w:tc>
         <w:tc>
           <w:tcPr>
-            <w:tcW w:type="dxa" w:w="1440"/>
+            <w:tcW w:type="dxa" w:w="1080"/>
             <w:tcBorders>
               <w:top w:val="nil"/>
               <w:bottom w:val="single" w:sz="12" w:space="0" w:color="000000"/>
@@ -680,13 +876,13 @@
                 <w:b w:val="0"/>
                 <w:sz w:val="22"/>
               </w:rPr>
-              <w:t>30</w:t>
+              <w:t>99</w:t>
             </w:r>
           </w:p>
         </w:tc>
         <w:tc>
           <w:tcPr>
-            <w:tcW w:type="dxa" w:w="1440"/>
+            <w:tcW w:type="dxa" w:w="1080"/>
             <w:tcBorders>
               <w:top w:val="nil"/>
               <w:bottom w:val="single" w:sz="12" w:space="0" w:color="000000"/>
@@ -710,7 +906,7 @@
         </w:tc>
         <w:tc>
           <w:tcPr>
-            <w:tcW w:type="dxa" w:w="1440"/>
+            <w:tcW w:type="dxa" w:w="1080"/>
             <w:tcBorders>
               <w:top w:val="nil"/>
               <w:bottom w:val="single" w:sz="12" w:space="0" w:color="000000"/>
@@ -728,13 +924,13 @@
                 <w:b w:val="0"/>
                 <w:sz w:val="22"/>
               </w:rPr>
-              <w:t>2.16</w:t>
+              <w:t>1.47</w:t>
             </w:r>
           </w:p>
         </w:tc>
         <w:tc>
           <w:tcPr>
-            <w:tcW w:type="dxa" w:w="1440"/>
+            <w:tcW w:type="dxa" w:w="1080"/>
             <w:tcBorders>
               <w:top w:val="nil"/>
               <w:bottom w:val="single" w:sz="12" w:space="0" w:color="000000"/>
@@ -752,13 +948,13 @@
                 <w:b w:val="0"/>
                 <w:sz w:val="22"/>
               </w:rPr>
-              <w:t>7.02</w:t>
+              <w:t>2.76</w:t>
             </w:r>
           </w:p>
         </w:tc>
         <w:tc>
           <w:tcPr>
-            <w:tcW w:type="dxa" w:w="1440"/>
+            <w:tcW w:type="dxa" w:w="1080"/>
             <w:tcBorders>
               <w:top w:val="nil"/>
               <w:bottom w:val="single" w:sz="12" w:space="0" w:color="000000"/>
@@ -776,7 +972,55 @@
                 <w:b w:val="0"/>
                 <w:sz w:val="22"/>
               </w:rPr>
-              <w:t>0.65</w:t>
+              <w:t>7.72</w:t>
+            </w:r>
+          </w:p>
+        </w:tc>
+        <w:tc>
+          <w:tcPr>
+            <w:tcW w:type="dxa" w:w="1080"/>
+            <w:tcBorders>
+              <w:top w:val="nil"/>
+              <w:bottom w:val="single" w:sz="12" w:space="0" w:color="000000"/>
+              <w:left w:val="nil"/>
+              <w:right w:val="nil"/>
+            </w:tcBorders>
+          </w:tcPr>
+          <w:p>
+            <w:pPr>
+              <w:jc w:val="right"/>
+            </w:pPr>
+            <w:r>
+              <w:rPr>
+                <w:rFonts w:ascii="Times New Roman" w:hAnsi="Times New Roman"/>
+                <w:b w:val="0"/>
+                <w:sz w:val="22"/>
+              </w:rPr>
+              <w:t>77.62</w:t>
+            </w:r>
+          </w:p>
+        </w:tc>
+        <w:tc>
+          <w:tcPr>
+            <w:tcW w:type="dxa" w:w="1080"/>
+            <w:tcBorders>
+              <w:top w:val="nil"/>
+              <w:bottom w:val="single" w:sz="12" w:space="0" w:color="000000"/>
+              <w:left w:val="nil"/>
+              <w:right w:val="nil"/>
+            </w:tcBorders>
+          </w:tcPr>
+          <w:p>
+            <w:pPr>
+              <w:jc w:val="right"/>
+            </w:pPr>
+            <w:r>
+              <w:rPr>
+                <w:rFonts w:ascii="Times New Roman" w:hAnsi="Times New Roman"/>
+                <w:b w:val="0"/>
+                <w:sz w:val="22"/>
+              </w:rPr>
+              <w:t>2.74</w:t>
             </w:r>
           </w:p>
         </w:tc>
@@ -794,7 +1038,7 @@
           <w:color w:val="404040"/>
           <w:sz w:val="18"/>
         </w:rPr>
-        <w:t>Polygon counts, extents, and totals aggregated over the change years 2017 to 2020: N and total are summed, min and max are the extremes across years, and mean is total area divided by N. The per-year export does not carry the underlying polygon areas, so a pooled median and standard deviation are not recoverable and are not shown. Beaver and insect and disease rest on few polygons (see the N column), so their statistics are based on limited data.</w:t>
+        <w:t>Areas converted to hectares (min, median, mean, standard deviation, and max) and square kilometers (total). Insect and disease rests on few polygons (99), so its distribution statistics are based on limited data.</w:t>
       </w:r>
     </w:p>
     <w:sectPr>

</xml_diff>